<commit_message>
docs: clean project documentation and test files
</commit_message>
<xml_diff>
--- a/outputs/generated_affidavit.docx
+++ b/outputs/generated_affidavit.docx
@@ -199,7 +199,7 @@
           <w:i w:val="0"/>
           <w:sz w:val="24"/>
         </w:rPr>
-        <w:t>I say that I am the Deputy Metropolitan Commissioner of the Respondent No. 2 above named in the above Writ Petition and am well acquainted with the facts and circumstances of the case. I have perused the Petition filed by Sunrise Housing Private Limited and the documents annexed thereto and am competent to affirm this Affidavit in Reply on behalf of Respondent No. 2, Mumbai Metropolitan Region Development Authority, to oppose the contentions raised in the Writ Petition and the reliefs sought by the Petitioner.</w:t>
+        <w:t>I say that I am the Deputy Metropolitan Commissioner of the Respondent No. 2 above named in the above Writ Petition and am well acquainted with the facts and circumstances of the case. I have perused the Petition and the documents annexed thereto and am competent to affirm this Affidavit in Reply.</w:t>
       </w:r>
     </w:p>
     <w:p>
@@ -224,7 +224,7 @@
           <w:i w:val="0"/>
           <w:sz w:val="24"/>
         </w:rPr>
-        <w:t>I say that Respondent No. 2 denies all statements, contentions and averments made in the Writ Petition except those specifically admitted in this Affidavit in Reply. Nothing contained in the Writ Petition that has not been specifically dealt with or admitted is to be treated as an admission by Respondent No. 2.</w:t>
+        <w:t>Respondent No. 2 denies all statements, contentions and averments made in the Writ Petition except those specifically admitted in this Affidavit in Reply. Nothing contained in the Writ Petition that has not been specifically dealt with or admitted is to be treated as an admission by Respondent No. 2.</w:t>
       </w:r>
     </w:p>
     <w:p>
@@ -274,7 +274,7 @@
           <w:i w:val="0"/>
           <w:sz w:val="24"/>
         </w:rPr>
-        <w:t>I say that Respondent No. 2 denies that the impugned communication dated 15 July 2026 was issued without authority.</w:t>
+        <w:t>Respondent No. 2 denies that the impugned communication dated 15 July 2026 was issued without authority.</w:t>
       </w:r>
     </w:p>
     <w:p>
@@ -324,7 +324,7 @@
           <w:i w:val="0"/>
           <w:sz w:val="24"/>
         </w:rPr>
-        <w:t xml:space="preserve">I say that Respondent No. 2 relies upon the communication dated 15 July 2026, a copy of which is annexed hereto and marked as </w:t>
+        <w:t xml:space="preserve">Respondent No. 2 relies upon the communication dated 15 July 2026. A copy of that communication is annexed and marked as </w:t>
       </w:r>
       <w:r>
         <w:rPr>

</xml_diff>

<commit_message>
Fix frontend production API configuration
</commit_message>
<xml_diff>
--- a/outputs/generated_affidavit.docx
+++ b/outputs/generated_affidavit.docx
@@ -199,7 +199,7 @@
           <w:i w:val="0"/>
           <w:sz w:val="24"/>
         </w:rPr>
-        <w:t>I say that I am the Deputy Metropolitan Commissioner of the Respondent No. 2 above named in the above Writ Petition and am well acquainted with the facts and circumstances of the case. I have perused the Petition and the documents annexed thereto and am competent to affirm this Affidavit in Reply.</w:t>
+        <w:t>I say that I am the Deputy Metropolitan Commissioner of the Respondent No. 2 above named in the above Writ Petition and am well acquainted with the facts and circumstances of the case. I have perused the Writ Petition filed by Sunrise Housing Private Limited and the documents annexed thereto and am competent to affirm this Affidavit in Reply on behalf of Respondent No. 2, Mumbai Metropolitan Region Development Authority, to oppose the contentions raised in the Writ Petition and the reliefs sought by the Petitioner.</w:t>
       </w:r>
     </w:p>
     <w:p>
@@ -224,7 +224,7 @@
           <w:i w:val="0"/>
           <w:sz w:val="24"/>
         </w:rPr>
-        <w:t>Respondent No. 2 denies all statements, contentions and averments made in the Writ Petition except those specifically admitted in this Affidavit in Reply. Nothing contained in the Writ Petition that has not been specifically dealt with or admitted is to be treated as an admission by Respondent No. 2.</w:t>
+        <w:t>I say that Respondent No. 2 denies all statements, contentions and averments made in the Writ Petition except those specifically admitted in this Affidavit in Reply. Nothing contained in the Writ Petition that has not been specifically dealt with or admitted is to be treated as an admission by Respondent No. 2.</w:t>
       </w:r>
     </w:p>
     <w:p>
@@ -274,7 +274,7 @@
           <w:i w:val="0"/>
           <w:sz w:val="24"/>
         </w:rPr>
-        <w:t>Respondent No. 2 denies that the impugned communication dated 15 July 2026 was issued without authority.</w:t>
+        <w:t>I say that Respondent No. 2 denies that the impugned communication dated 15 July 2026 was issued without authority.</w:t>
       </w:r>
     </w:p>
     <w:p>
@@ -324,7 +324,7 @@
           <w:i w:val="0"/>
           <w:sz w:val="24"/>
         </w:rPr>
-        <w:t xml:space="preserve">Respondent No. 2 relies upon the communication dated 15 July 2026. A copy of that communication is annexed and marked as </w:t>
+        <w:t xml:space="preserve">I say that Respondent No. 2 relies upon the communication dated 15 July 2026, a copy whereof is annexed hereto and marked as </w:t>
       </w:r>
       <w:r>
         <w:rPr>

</xml_diff>